<commit_message>
Audit docx: widen owner column in bug list
Co-Authored-By: Claude Opus 5.5 <noreply@anthropic.com>
</commit_message>
<xml_diff>
--- a/docs/Usman_Week1-4_Audit.docx
+++ b/docs/Usman_Week1-4_Audit.docx
@@ -2135,10 +2135,10 @@
       </w:tblPr>
       <w:tblGrid>
         <w:gridCol w:w="500"/>
-        <w:gridCol w:w="1300"/>
-        <w:gridCol w:w="4626"/>
-        <w:gridCol w:w="1300"/>
-        <w:gridCol w:w="1300"/>
+        <w:gridCol w:w="1150"/>
+        <w:gridCol w:w="3876"/>
+        <w:gridCol w:w="2300"/>
+        <w:gridCol w:w="1200"/>
       </w:tblGrid>
       <w:tr>
         <w:trPr>
@@ -2168,7 +2168,7 @@
         </w:tc>
         <w:tc>
           <w:tcPr>
-            <w:tcW w:type="dxa" w:w="1300"/>
+            <w:tcW w:type="dxa" w:w="1150"/>
             <w:shd w:fill="7A1F2B" w:color="auto" w:val="clear"/>
             <w:tcMar>
               <w:top w:type="dxa" w:w="60"/>
@@ -2190,7 +2190,7 @@
         </w:tc>
         <w:tc>
           <w:tcPr>
-            <w:tcW w:type="dxa" w:w="4626"/>
+            <w:tcW w:type="dxa" w:w="3876"/>
             <w:shd w:fill="7A1F2B" w:color="auto" w:val="clear"/>
             <w:tcMar>
               <w:top w:type="dxa" w:w="60"/>
@@ -2212,7 +2212,7 @@
         </w:tc>
         <w:tc>
           <w:tcPr>
-            <w:tcW w:type="dxa" w:w="1300"/>
+            <w:tcW w:type="dxa" w:w="2300"/>
             <w:shd w:fill="7A1F2B" w:color="auto" w:val="clear"/>
             <w:tcMar>
               <w:top w:type="dxa" w:w="60"/>
@@ -2234,7 +2234,7 @@
         </w:tc>
         <w:tc>
           <w:tcPr>
-            <w:tcW w:type="dxa" w:w="1300"/>
+            <w:tcW w:type="dxa" w:w="1200"/>
             <w:shd w:fill="7A1F2B" w:color="auto" w:val="clear"/>
             <w:tcMar>
               <w:top w:type="dxa" w:w="60"/>
@@ -2274,7 +2274,7 @@
         </w:tc>
         <w:tc>
           <w:tcPr>
-            <w:tcW w:type="dxa" w:w="1300"/>
+            <w:tcW w:type="dxa" w:w="1150"/>
             <w:tcMar>
               <w:top w:type="dxa" w:w="60"/>
               <w:left w:type="dxa" w:w="100"/>
@@ -2290,7 +2290,7 @@
         </w:tc>
         <w:tc>
           <w:tcPr>
-            <w:tcW w:type="dxa" w:w="4626"/>
+            <w:tcW w:type="dxa" w:w="3876"/>
             <w:tcMar>
               <w:top w:type="dxa" w:w="60"/>
               <w:left w:type="dxa" w:w="100"/>
@@ -2306,7 +2306,7 @@
         </w:tc>
         <w:tc>
           <w:tcPr>
-            <w:tcW w:type="dxa" w:w="1300"/>
+            <w:tcW w:type="dxa" w:w="2300"/>
             <w:tcMar>
               <w:top w:type="dxa" w:w="60"/>
               <w:left w:type="dxa" w:w="100"/>
@@ -2322,7 +2322,7 @@
         </w:tc>
         <w:tc>
           <w:tcPr>
-            <w:tcW w:type="dxa" w:w="1300"/>
+            <w:tcW w:type="dxa" w:w="1200"/>
             <w:shd w:fill="D9EAD3" w:color="auto" w:val="clear"/>
             <w:tcMar>
               <w:top w:type="dxa" w:w="60"/>
@@ -2357,7 +2357,7 @@
         </w:tc>
         <w:tc>
           <w:tcPr>
-            <w:tcW w:type="dxa" w:w="1300"/>
+            <w:tcW w:type="dxa" w:w="1150"/>
             <w:tcMar>
               <w:top w:type="dxa" w:w="60"/>
               <w:left w:type="dxa" w:w="100"/>
@@ -2373,7 +2373,7 @@
         </w:tc>
         <w:tc>
           <w:tcPr>
-            <w:tcW w:type="dxa" w:w="4626"/>
+            <w:tcW w:type="dxa" w:w="3876"/>
             <w:tcMar>
               <w:top w:type="dxa" w:w="60"/>
               <w:left w:type="dxa" w:w="100"/>
@@ -2389,7 +2389,7 @@
         </w:tc>
         <w:tc>
           <w:tcPr>
-            <w:tcW w:type="dxa" w:w="1300"/>
+            <w:tcW w:type="dxa" w:w="2300"/>
             <w:tcMar>
               <w:top w:type="dxa" w:w="60"/>
               <w:left w:type="dxa" w:w="100"/>
@@ -2405,7 +2405,7 @@
         </w:tc>
         <w:tc>
           <w:tcPr>
-            <w:tcW w:type="dxa" w:w="1300"/>
+            <w:tcW w:type="dxa" w:w="1200"/>
             <w:shd w:fill="D9EAD3" w:color="auto" w:val="clear"/>
             <w:tcMar>
               <w:top w:type="dxa" w:w="60"/>
@@ -2440,7 +2440,7 @@
         </w:tc>
         <w:tc>
           <w:tcPr>
-            <w:tcW w:type="dxa" w:w="1300"/>
+            <w:tcW w:type="dxa" w:w="1150"/>
             <w:tcMar>
               <w:top w:type="dxa" w:w="60"/>
               <w:left w:type="dxa" w:w="100"/>
@@ -2456,7 +2456,7 @@
         </w:tc>
         <w:tc>
           <w:tcPr>
-            <w:tcW w:type="dxa" w:w="4626"/>
+            <w:tcW w:type="dxa" w:w="3876"/>
             <w:tcMar>
               <w:top w:type="dxa" w:w="60"/>
               <w:left w:type="dxa" w:w="100"/>
@@ -2472,7 +2472,7 @@
         </w:tc>
         <w:tc>
           <w:tcPr>
-            <w:tcW w:type="dxa" w:w="1300"/>
+            <w:tcW w:type="dxa" w:w="2300"/>
             <w:tcMar>
               <w:top w:type="dxa" w:w="60"/>
               <w:left w:type="dxa" w:w="100"/>
@@ -2488,7 +2488,7 @@
         </w:tc>
         <w:tc>
           <w:tcPr>
-            <w:tcW w:type="dxa" w:w="1300"/>
+            <w:tcW w:type="dxa" w:w="1200"/>
             <w:shd w:fill="D9EAD3" w:color="auto" w:val="clear"/>
             <w:tcMar>
               <w:top w:type="dxa" w:w="60"/>
@@ -2523,7 +2523,7 @@
         </w:tc>
         <w:tc>
           <w:tcPr>
-            <w:tcW w:type="dxa" w:w="1300"/>
+            <w:tcW w:type="dxa" w:w="1150"/>
             <w:tcMar>
               <w:top w:type="dxa" w:w="60"/>
               <w:left w:type="dxa" w:w="100"/>
@@ -2539,7 +2539,7 @@
         </w:tc>
         <w:tc>
           <w:tcPr>
-            <w:tcW w:type="dxa" w:w="4626"/>
+            <w:tcW w:type="dxa" w:w="3876"/>
             <w:tcMar>
               <w:top w:type="dxa" w:w="60"/>
               <w:left w:type="dxa" w:w="100"/>
@@ -2555,7 +2555,7 @@
         </w:tc>
         <w:tc>
           <w:tcPr>
-            <w:tcW w:type="dxa" w:w="1300"/>
+            <w:tcW w:type="dxa" w:w="2300"/>
             <w:tcMar>
               <w:top w:type="dxa" w:w="60"/>
               <w:left w:type="dxa" w:w="100"/>
@@ -2571,7 +2571,7 @@
         </w:tc>
         <w:tc>
           <w:tcPr>
-            <w:tcW w:type="dxa" w:w="1300"/>
+            <w:tcW w:type="dxa" w:w="1200"/>
             <w:shd w:fill="FCE5CD" w:color="auto" w:val="clear"/>
             <w:tcMar>
               <w:top w:type="dxa" w:w="60"/>
@@ -2606,7 +2606,7 @@
         </w:tc>
         <w:tc>
           <w:tcPr>
-            <w:tcW w:type="dxa" w:w="1300"/>
+            <w:tcW w:type="dxa" w:w="1150"/>
             <w:tcMar>
               <w:top w:type="dxa" w:w="60"/>
               <w:left w:type="dxa" w:w="100"/>
@@ -2622,7 +2622,7 @@
         </w:tc>
         <w:tc>
           <w:tcPr>
-            <w:tcW w:type="dxa" w:w="4626"/>
+            <w:tcW w:type="dxa" w:w="3876"/>
             <w:tcMar>
               <w:top w:type="dxa" w:w="60"/>
               <w:left w:type="dxa" w:w="100"/>
@@ -2638,7 +2638,7 @@
         </w:tc>
         <w:tc>
           <w:tcPr>
-            <w:tcW w:type="dxa" w:w="1300"/>
+            <w:tcW w:type="dxa" w:w="2300"/>
             <w:tcMar>
               <w:top w:type="dxa" w:w="60"/>
               <w:left w:type="dxa" w:w="100"/>
@@ -2654,7 +2654,7 @@
         </w:tc>
         <w:tc>
           <w:tcPr>
-            <w:tcW w:type="dxa" w:w="1300"/>
+            <w:tcW w:type="dxa" w:w="1200"/>
             <w:shd w:fill="D9EAD3" w:color="auto" w:val="clear"/>
             <w:tcMar>
               <w:top w:type="dxa" w:w="60"/>

</xml_diff>